<commit_message>
Finalize manuscript package after internal checklist removal
</commit_message>
<xml_diff>
--- a/Blood_Advances_manuscript_final.docx
+++ b/Blood_Advances_manuscript_final.docx
@@ -886,62 +886,6 @@
         <w:t>(A) Multivariate partial R2, median gene-level correlation, and median response-effect attenuation after removing genes directly overlapping the platelet score; bars show patient-bootstrap 95% confidence intervals and the annotation reports fully nested leave-one-patient-out held-out transcriptome R2. (B) Platelet-abundance-adjusted young-platelet residuals across 25-, 50-, and 100-gene definitions. (C) Complete-case month-1 platelet-score changes. (D) Six-component operational audit for composition dominance. The age and month-1 panels are exploratory.</w:t>
       </w:r>
     </w:p>
-    <w:p>
-      <w:pPr>
-        <w:pStyle w:val="Heading1"/>
-      </w:pPr>
-      <w:r>
-        <w:t>Items requiring author input before submission</w:t>
-      </w:r>
-    </w:p>
-    <w:p>
-      <w:pPr>
-        <w:pStyle w:val="ListBullet"/>
-      </w:pPr>
-      <w:r>
-        <w:t>Author list, affiliations, corresponding author, funding and conflicts.</w:t>
-      </w:r>
-    </w:p>
-    <w:p>
-      <w:pPr>
-        <w:pStyle w:val="ListBullet"/>
-      </w:pPr>
-      <w:r>
-        <w:t>Original GSE112278 response definition and clinical inclusion wording, checked against the source article.</w:t>
-      </w:r>
-    </w:p>
-    <w:p>
-      <w:pPr>
-        <w:pStyle w:val="ListBullet"/>
-      </w:pPr>
-      <w:r>
-        <w:t>Ethics/data-availability language appropriate for secondary analysis of public de-identified data.</w:t>
-      </w:r>
-    </w:p>
-    <w:p>
-      <w:pPr>
-        <w:pStyle w:val="ListBullet"/>
-      </w:pPr>
-      <w:r>
-        <w:t>Completion and formatting of the full reference list to current Blood Advances style.</w:t>
-      </w:r>
-    </w:p>
-    <w:p>
-      <w:pPr>
-        <w:pStyle w:val="ListBullet"/>
-      </w:pPr>
-      <w:r>
-        <w:t>Confirmation of whether SDPR should be reported as the legacy alias of CAVIN2 throughout.</w:t>
-      </w:r>
-    </w:p>
-    <w:p>
-      <w:pPr>
-        <w:pStyle w:val="ListBullet"/>
-      </w:pPr>
-      <w:r>
-        <w:t>A public code/data repository URL and versioned release identifier.</w:t>
-      </w:r>
-    </w:p>
     <w:sectPr>
       <w:headerReference w:type="default" r:id="rId9"/>
       <w:footerReference w:type="default" r:id="rId10"/>

</xml_diff>